<commit_message>
show rabatt in file for bwt
</commit_message>
<xml_diff>
--- a/src/Angebot-BWT.docx
+++ b/src/Angebot-BWT.docx
@@ -1908,7 +1908,115 @@
         <w:pBdr/>
         <w:pStyle w:val="Normal"/>
         <w:spacing w:line="283" w:lineRule="auto"/>
-        <w:ind w:left="125" w:right="1024" w:firstLine="0"/>
+        <w:ind w:left="125" w:right="1024"/>
+        <w:rPr>
+          <w:rFonts w:ascii="Open Sans" w:eastAsia="Open Sans" w:hAnsi="Open Sans" w:cs="Open Sans"/>
+          <w:b w:val="0"/>
+          <w:i w:val="0"/>
+          <w:iCs w:val="0"/>
+          <w:color w:val="auto"/>
+          <w:sz w:val="22"/>
+        </w:rPr>
+      </w:pPr>
+      <w:r>
+        <w:rPr>
+          <w:rFonts w:ascii="Open Sans" w:eastAsia="Open Sans" w:hAnsi="Open Sans" w:cs="Open Sans"/>
+          <w:color w:val="030303"/>
+        </w:rPr>
+        <w:t xml:space="preserve">Diese werden vorab mit Ihnen besprochen, bedürfen lhrer Zustimmung und werden auf Regiebasis nach tatsächlichem Aufwand abgerechnet. (Stundensatz-Facharbeiter: {RegieRateFmt} netto){#hasSubsidyLine}</w:t>
+      </w:r>
+      <w:r>
+        <w:rPr/>
+        <w:br/>
+      </w:r>
+      <w:r>
+        <w:rPr/>
+        <w:br/>
+      </w:r>
+      <w:r>
+        <w:rPr>
+          <w:rFonts w:ascii="Open Sans" w:eastAsia="Open Sans" w:hAnsi="Open Sans" w:cs="Open Sans"/>
+          <w:color w:val="030303"/>
+        </w:rPr>
+        <w:t xml:space="preserve">Der Selbstkostenanteil beträgt </w:t>
+      </w:r>
+      <w:r>
+        <w:rPr>
+          <w:rFonts w:ascii="Open Sans" w:eastAsia="Open Sans" w:hAnsi="Open Sans" w:cs="Open Sans"/>
+          <w:b/>
+          <w:bCs/>
+          <w:color w:val="030303"/>
+        </w:rPr>
+        <w:t xml:space="preserve">{SelbstkostenanteilFmt}</w:t>
+      </w:r>
+      <w:r>
+        <w:rPr>
+          <w:rFonts w:ascii="Open Sans" w:eastAsia="Open Sans" w:hAnsi="Open Sans" w:cs="Open Sans"/>
+          <w:color w:val="030303"/>
+        </w:rPr>
+        <w:t xml:space="preserve"> unter Berücksichtigung eines gewährten Zuschusses durch die Pflegekasse i.H.v. </w:t>
+      </w:r>
+      <w:r>
+        <w:rPr>
+          <w:rFonts w:ascii="Open Sans" w:eastAsia="Open Sans" w:hAnsi="Open Sans" w:cs="Open Sans"/>
+          <w:b/>
+          <w:bCs/>
+          <w:color w:val="030303"/>
+        </w:rPr>
+        <w:t xml:space="preserve">{Zuschusskrankenkasse}</w:t>
+      </w:r>
+      <w:r>
+        <w:rPr>
+          <w:rFonts w:ascii="Open Sans" w:eastAsia="Open Sans" w:hAnsi="Open Sans" w:cs="Open Sans"/>
+          <w:color w:val="030303"/>
+        </w:rPr>
+        <w:t xml:space="preserve">.{/hasSubsidyLine}</w:t>
+      </w:r>
+      <w:r>
+        <w:rPr>
+          <w:rFonts w:ascii="Open Sans" w:eastAsia="Open Sans" w:hAnsi="Open Sans" w:cs="Open Sans"/>
+          <w:color w:val="030303"/>
+        </w:rPr>
+        <w:br/>
+      </w:r>
+      <w:r>
+        <w:rPr>
+          <w:sz w:val="22"/>
+        </w:rPr>
+        <w:t xml:space="preserve">{#SelfPayLines}</w:t>
+      </w:r>
+      <w:r>
+        <w:rPr>
+          <w:sz w:val="22"/>
+        </w:rPr>
+        <w:br/>
+      </w:r>
+      <w:r>
+        <w:rPr>
+          <w:sz w:val="22"/>
+        </w:rPr>
+        <w:t xml:space="preserve">{#IsTitle}</w:t>
+      </w:r>
+      <w:r>
+        <w:rPr>
+          <w:b/>
+          <w:sz w:val="22"/>
+        </w:rPr>
+        <w:t xml:space="preserve">{Text}</w:t>
+      </w:r>
+      <w:r>
+        <w:rPr>
+          <w:sz w:val="22"/>
+        </w:rPr>
+        <w:t xml:space="preserve">{/IsTitle}{^IsTitle}{Text}{/IsTitle}{/SelfPayLines}</w:t>
+      </w:r>
+    </w:p>
+    <w:p>
+      <w:pPr>
+        <w:pBdr/>
+        <w:pStyle w:val="Normal"/>
+        <w:spacing w:line="283" w:lineRule="auto"/>
+        <w:ind w:left="125" w:right="1024"/>
         <w:rPr>
           <w:rFonts w:ascii="Open Sans" w:eastAsia="Open Sans" w:hAnsi="Open Sans" w:cs="Open Sans"/>
           <w:b/>
@@ -1916,6 +2024,7 @@
           <w:i/>
           <w:iCs/>
           <w:color w:val="030303"/>
+          <w:sz w:val="22"/>
         </w:rPr>
       </w:pPr>
       <w:r>
@@ -1923,86 +2032,8 @@
           <w:rFonts w:ascii="Open Sans" w:eastAsia="Open Sans" w:hAnsi="Open Sans" w:cs="Open Sans"/>
           <w:color w:val="030303"/>
         </w:rPr>
-        <w:t xml:space="preserve">Diese werden vorab mit Ihnen besprochen, bedürfen lhrer Zustimmung und werden auf Regiebasis nach tatsächlichem Aufwand abgerechnet. (Stundensatz-Facharbeiter: {RegieRateFmt} netto){#hasSubsidyLine}</w:t>
-      </w:r>
-      <w:r>
-        <w:rPr/>
         <w:br/>
       </w:r>
-      <w:r>
-        <w:rPr/>
-        <w:br/>
-      </w:r>
-      <w:r>
-        <w:rPr>
-          <w:rFonts w:ascii="Open Sans" w:eastAsia="Open Sans" w:hAnsi="Open Sans" w:cs="Open Sans"/>
-          <w:color w:val="030303"/>
-        </w:rPr>
-        <w:t xml:space="preserve">Der Selbstkostenanteil beträgt </w:t>
-      </w:r>
-      <w:r>
-        <w:rPr>
-          <w:rFonts w:ascii="Open Sans" w:eastAsia="Open Sans" w:hAnsi="Open Sans" w:cs="Open Sans"/>
-          <w:b/>
-          <w:bCs/>
-          <w:color w:val="030303"/>
-        </w:rPr>
-        <w:t xml:space="preserve">{SelbstkostenanteilFmt}</w:t>
-      </w:r>
-      <w:r>
-        <w:rPr>
-          <w:rFonts w:ascii="Open Sans" w:eastAsia="Open Sans" w:hAnsi="Open Sans" w:cs="Open Sans"/>
-          <w:color w:val="030303"/>
-        </w:rPr>
-        <w:t xml:space="preserve"> unter Berücksichtigung eines gewährten Zuschusses durch die Pflegekasse i.H.v. </w:t>
-      </w:r>
-      <w:r>
-        <w:rPr>
-          <w:rFonts w:ascii="Open Sans" w:eastAsia="Open Sans" w:hAnsi="Open Sans" w:cs="Open Sans"/>
-          <w:b/>
-          <w:bCs/>
-          <w:color w:val="030303"/>
-        </w:rPr>
-        <w:t xml:space="preserve">{Zuschusskrankenkasse}</w:t>
-      </w:r>
-      <w:r>
-        <w:rPr>
-          <w:rFonts w:ascii="Open Sans" w:eastAsia="Open Sans" w:hAnsi="Open Sans" w:cs="Open Sans"/>
-          <w:color w:val="030303"/>
-        </w:rPr>
-        <w:t xml:space="preserve">.{/hasSubsidyLine}</w:t>
-      </w:r>
-    </w:p>
-    <w:p>
-      <w:pPr>
-        <w:pBdr/>
-        <w:pStyle w:val="Normal"/>
-        <w:spacing w:before="224" w:after="0" w:line="288" w:lineRule="auto"/>
-        <w:ind w:left="125" w:right="0" w:firstLine="0"/>
-        <w:rPr>
-          <w:rFonts w:ascii="Open Sans" w:eastAsia="Open Sans" w:hAnsi="Open Sans" w:cs="Open Sans"/>
-          <w:color w:val="030303"/>
-        </w:rPr>
-      </w:pPr>
-      <w:r>
-        <w:rPr>
-          <w:rFonts w:ascii="Open Sans" w:eastAsia="Open Sans" w:hAnsi="Open Sans" w:cs="Open Sans"/>
-          <w:color w:val="030303"/>
-        </w:rPr>
-        <w:t xml:space="preserve">Dieser wird bei Auftragsbestätigung vorab fällig.</w:t>
-      </w:r>
-    </w:p>
-    <w:p>
-      <w:pPr>
-        <w:pBdr/>
-        <w:pStyle w:val="Normal"/>
-        <w:spacing w:before="215" w:after="0" w:line="286" w:lineRule="auto"/>
-        <w:ind w:left="123" w:right="222" w:firstLine="0"/>
-        <w:rPr>
-          <w:rFonts w:ascii="Open Sans" w:eastAsia="Open Sans" w:hAnsi="Open Sans" w:cs="Open Sans"/>
-          <w:color w:val="000000"/>
-        </w:rPr>
-      </w:pPr>
       <w:r>
         <w:rPr>
           <w:rFonts w:ascii="Open Sans" w:eastAsia="Open Sans" w:hAnsi="Open Sans" w:cs="Open Sans"/>
@@ -2841,7 +2872,7 @@
               <w:sz w:val="22"/>
               <w:szCs w:val="22"/>
             </w:rPr>
-            <w:t xml:space="preserve">1</w:t>
+            <w:t xml:space="preserve">2</w:t>
           </w:r>
           <w:r>
             <w:rPr>
@@ -3391,6 +3422,7 @@
   <w:style w:type="paragraph" w:styleId="Heading">
     <w:name w:val="Heading"/>
     <w:basedOn w:val="Normal"/>
+    <w:next w:val="Heading"/>
     <w:pPr>
       <w:pBdr/>
       <w:keepNext/>

</xml_diff>